<commit_message>
Document public deployment and verified live Python multiplayer
</commit_message>
<xml_diff>
--- a/docx/03-开发状态与验收记录.docx
+++ b/docx/03-开发状态与验收记录.docx
@@ -12,7 +12,7 @@
     </w:p>
     <w:p>
       <w:r>
-        <w:t>记录日期：2026-09-13 / 阶段：第一版实现和本地验收完成，发布中</w:t>
+        <w:t>记录日期：2026-09-13 / 阶段：第一版已公开发布，线上验收通过</w:t>
       </w:r>
     </w:p>
     <w:p>
@@ -40,7 +40,7 @@
     </w:p>
     <w:p>
       <w:r>
-        <w:t>访问范围：用户已明确选择公开链接。Sites 访问策略已设置为 public。M4 公开部署正在进行；部署成功与线上验证结果将在本文件补充。</w:t>
+        <w:t>访问范围：用户已明确选择公开链接。Sites 访问策略已设置为 public。M4 公开部署已成功。网址：https://codefront-arena.hjkc20050804.chatgpt.site 。Sites 版本 1 对应应用提交 57f09cee056d3da070ea11441aeabd258a90c405；后续仅文档或验收脚本更新不改变线上应用。</w:t>
       </w:r>
     </w:p>
     <w:p>
@@ -58,7 +58,7 @@
     </w:p>
     <w:p>
       <w:r>
-        <w:t>规则测试：5 项通过。包括动作所有权和有限坐标、资源必须交付、死机不采集、确定性完整比赛、同时击毁、观察数据归属；事件列表数量有界。</w:t>
+        <w:t>规则测试：5 项通过。包括动作所有权和有限坐标、资源必须交付、被击毁的机器人不采集、确定性完整比赛、同时击毁、观察数据归属；事件列表数量有界。</w:t>
       </w:r>
     </w:p>
     <w:p>
@@ -78,7 +78,17 @@
     </w:p>
     <w:p>
       <w:r>
-        <w:t>证据位置：可复用脚本 scripts/browser-check.cjs、tests/game.test.ts；本地证据 .qa/browser-results.json、.qa/full-match-results.json 与桌面、手机、手册、联机截图。QA 目录不进入 Git，避免携带临时会话。文档使用 Word 导出 PDF 再逐页检查；当前环境无可用的 bundled LibreOffice。</w:t>
+        <w:t>线上验收：在公开网址使用本机 Chrome 执行完整浏览器检查，Python 运行、修改行为、暂停、死循环隔离、移动布局、三个独立客户端房间和授权检查全部通过，没有 pageerror。完整三分钟 UI 比赛在本地完成；线上验证了多客户端创建、加入、启动、动作同步，未另跑完整三分钟线上比赛。</w:t>
+      </w:r>
+    </w:p>
+    <w:p>
+      <w:r>
+        <w:t>GitHub CI：应用提交 57f09cee056d3da070ea11441aeabd258a90c405 的工作流 34740735383 已成功（https://github.com/hjkc111/codinggame/actions/runs/34740735383）。本地规则、构建、线上行为与 CI 分别验证。</w:t>
+      </w:r>
+    </w:p>
+    <w:p>
+      <w:r>
+        <w:t>证据位置：可复用脚本 scripts/browser-check.cjs、scripts/full-match.cjs、tests/game.test.ts；本地证据 .qa/browser-results.json、.qa/full-match-results.json 与桌面、手机、手册、联机截图。QA 目录不进入 Git，避免携带临时会话。文档使用 Word 导出 PDF 再逐页检查；当前环境无可用的 bundled LibreOffice。</w:t>
       </w:r>
     </w:p>
     <w:p>

</xml_diff>

<commit_message>
Polish round status and record complete series verification
</commit_message>
<xml_diff>
--- a/docx/03-开发状态与验收记录.docx
+++ b/docx/03-开发状态与验收记录.docx
@@ -12,7 +12,7 @@
     </w:p>
     <w:p>
       <w:r>
-        <w:t>记录日期：2026-09-13 / 阶段：第一版已公开发布，线上验收通过</w:t>
+        <w:t>记录日期：2026-09-13 ｜ 阶段：v0.2 本地验收完成，待公开发布</w:t>
       </w:r>
     </w:p>
     <w:p>
@@ -25,22 +25,27 @@
     </w:p>
     <w:p>
       <w:r>
-        <w:t>已完成 M0–M3：设计文档、实现手册、开发计划、Sites 关联、GitHub 推送；真实 Python 与 JavaScript；三角色采集战斗；运行、暂停、重置、热部署；2–4 人云端房间；昵称、房间码、房主启动、刷新恢复；自由查阅的五章手册。</w:t>
+        <w:t>本轮已实现：双人最多三局、先赢两局；三至四人三轮积分赛；平局与并列积分；每轮轮换出生位置；所有玩家验证并准备后进入三秒倒计时；首轮不限时、局间五分钟提醒，时间到不会强制开战。</w:t>
       </w:r>
     </w:p>
     <w:p>
       <w:r>
-        <w:t>已完成产品画面：深色战术桌面、平滑移动、资源脉冲、攻击线、交付加分、重生光环、队伍卡片、路径与射程辅助、目标观察、错误日志。操作按钮位于代码区顶部，进入页面即可运行。</w:t>
+        <w:t>局间保留草稿与成功部署的解释器，清空显式 memory 和动作；展示采集能量、交付能量、死亡次数、历史比分、累计积分或胜场。整场结束由房主原房间再赛，代码仍保留。</w:t>
       </w:r>
     </w:p>
     <w:p>
       <w:r>
-        <w:t>技术实现：Sites Worker + D1，前端 Pyodide 0.27.7 同源静态运行时；JavaScript Worker；约 250ms 决策、400ms 房间请求、最大 50ms 模拟步长；独立 Worker 超时终止；代码更新失败继续旧版。GitHub origin 为 hjkc111/codinggame，Sites 使用独立发布 remote。</w:t>
+        <w:t>配套优化：核心价值与货舱格数分开，避免 20/5 的超载显示及异常减速；match/round 与 revision 隔离延迟指令和旧快照；修正异步决策返回时切换版本可能终止后续循环的问题；编辑草稿取消准备。</w:t>
       </w:r>
     </w:p>
     <w:p>
       <w:r>
-        <w:t>访问范围：用户已明确选择公开链接。Sites 访问策略已设置为 public。M4 公开部署已成功。网址：https://codefront-arena.hjkc20050804.chatgpt.site 。Sites 版本 1 对应应用提交 57f09cee056d3da070ea11441aeabd258a90c405；后续仅文档或验收脚本更新不改变线上应用。</w:t>
+        <w:t>保留原有功能：真实 Python / JavaScript、单人训练、三角色采集/攻击/卸货/重生、热部署失败保留旧版、手册按需查阅、暂停和重置训练、代码下载、本机草稿、云端房间和刷新恢复。</w:t>
+      </w:r>
+    </w:p>
+    <w:p>
+      <w:r>
+        <w:t>文档：04 是本轮权威设计与优化计划，共六页；README 更新本地运行和新 API。01、02 是首版历史设计，有冲突时以 04 和网页手册为准。03 记录当前状态和实测范围。</w:t>
       </w:r>
     </w:p>
     <w:p>
@@ -53,42 +58,37 @@
         <w:pStyle w:val="Heading1"/>
       </w:pPr>
       <w:r>
-        <w:t>已执行验收</w:t>
+        <w:t>测试与验收证据</w:t>
       </w:r>
     </w:p>
     <w:p>
       <w:r>
-        <w:t>规则测试：5 项通过。包括动作所有权和有限坐标、资源必须交付、被击毁的机器人不采集、确定性完整比赛、同时击毁、观察数据归属；事件列表数量有界。</w:t>
+        <w:t>规则与状态机：13 项测试通过。覆盖动作所有权、有限坐标、采集必须交付、确定性、同时击毁、观察归属、提醒超时不强开、倒计时取消、双人提前结束、三轮平局、多人平均积分、位置轮换、重复结算、旧轮和旧场指令、原房间重开及核心格数统计。</w:t>
       </w:r>
     </w:p>
     <w:p>
       <w:r>
-        <w:t>类型与构建：TypeScript 无错误；Vinext 五阶段构建完成，生成 Worker、静态资源、D1 迁移。构建 Worker 在本地端口 8787 单独验证，不仅测试开发服务器。</w:t>
+        <w:t>构建：TypeScript 检查通过；Vinext 生产构建成功。测试使用构建后的本地 Worker 与真实 D1，不只测试开发页面。网页样式的轮次文字对比度经截图复核后调整。</w:t>
       </w:r>
     </w:p>
     <w:p>
       <w:r>
-        <w:t>浏览器：Chrome 独立上下文验证 Python 实际运行；修改程序后机器人转为前往中心；暂停后计时不变；死循环触发超时但页面可操作且旧版本继续；手册自由打开关闭；390px 手机宽度没有横向溢出；无浏览器 pageerror。</w:t>
+        <w:t>浏览器基础验收通过：真实 Python 执行、修改策略后行为改变、暂停训练、死循环触发超时且旧版继续、自由打开手册、390px 手机布局没有横向溢出；三客户端 API 创建/加入/准备/同步、房主权限和禁止中途加入通过；无 pageerror。</w:t>
       </w:r>
     </w:p>
     <w:p>
       <w:r>
-        <w:t>多人：三位玩家从真实房间界面创建、加入并开始完整 180 秒比赛，使用 Python / JavaScript / Python。中途刷新第三位玩家，恢复席位并重新运行 Python；所有客户端最终比分完全一致。另测非房主启动返回 403、开始后加入返回 409，真实 API 三客户端同步通过。</w:t>
+        <w:t>完整赛程已通过：三个独立 Chrome 上下文，运行 Python / JavaScript / Python，真实每轮 180 秒，共三轮。每位玩家每轮都交付得分，客户端各轮比分完全一致。验证刷新恢复、编辑取消准备、代码跨轮保留、手机复盘布局及原房间再赛。最终累计积分为 Alpha 5、Bravo 6、Charlie 7，冠军 Charlie。完整赛程后另补解释器 closed 检查与轮次文字对比度修正；它们纳入最终构建和线上检查。</w:t>
       </w:r>
     </w:p>
     <w:p>
       <w:r>
-        <w:t>线上验收：在公开网址使用本机 Chrome 执行完整浏览器检查，Python 运行、修改行为、暂停、死循环隔离、移动布局、三个独立客户端房间和授权检查全部通过，没有 pageerror。完整三分钟 UI 比赛在本地完成；线上验证了多客户端创建、加入、启动、动作同步，未另跑完整三分钟线上比赛。</w:t>
+        <w:t>可复用测试：tests/game.test.ts、tests/series.test.ts、scripts/browser-check.cjs、scripts/full-match.cjs。浏览器脚本通过 TEST_URL 切换本地或线上；完整脚本检查每位玩家每轮实际交付、代码保留、手机复盘布局和整场再赛。</w:t>
       </w:r>
     </w:p>
     <w:p>
       <w:r>
-        <w:t>GitHub CI：应用提交 57f09cee056d3da070ea11441aeabd258a90c405 的工作流 34740735383 已成功（https://github.com/hjkc111/codinggame/actions/runs/34740735383）。本地规则、构建、线上行为与 CI 分别验证。</w:t>
-      </w:r>
-    </w:p>
-    <w:p>
-      <w:r>
-        <w:t>证据位置：可复用脚本 scripts/browser-check.cjs、scripts/full-match.cjs、tests/game.test.ts；本地证据 .qa/browser-results.json、.qa/full-match-results.json 与桌面、手机、手册、联机截图。QA 目录不进入 Git，避免携带临时会话。文档使用 Word 导出 PDF 再逐页检查；当前环境无可用的 bundled LibreOffice。</w:t>
+        <w:t>本地证据位于忽略的 .qa/：browser-results.json、full-match-results.json、series-round-1/2/3.png、series-mobile.png。QA 不入 Git，不存放用户凭证。Word 文档用 Word 导出 PDF、Poppler 渲染并逐页检查。</w:t>
       </w:r>
     </w:p>
     <w:p>
@@ -101,22 +101,70 @@
         <w:pStyle w:val="Heading1"/>
       </w:pPr>
       <w:r>
-        <w:t>限制与后续目标</w:t>
+        <w:t>发布与维护记录</w:t>
       </w:r>
     </w:p>
     <w:p>
       <w:r>
-        <w:t>未完成且未宣称：服务器 Python 沙箱、严格防作弊、排名、5–8 人、团队模式、障碍地图、战争迷雾、完整持久回放、服务器常驻决策、房间过期自动清理。当前是公开链接的休闲首版。</w:t>
+        <w:t>原公开网站：https://codefront-arena.hjkc20050804.chatgpt.site 。保留公开访问和原 Sites / GitHub 关联。</w:t>
       </w:r>
     </w:p>
     <w:p>
       <w:r>
-        <w:t>并发容量与稳定 60fps 尚未做生产压测，不提供性能保证。HTTP 请求频率并不等于网络实时延迟；线上延迟需独立测量。公开页面的 Python 在用户设备执行，不能证明动作来自提交的代码。</w:t>
+        <w:t>本轮应用尚未发布；完整赛程通过后发布并执行线上功能验收。此前线上版本为 Sites 版本 1；本轮不会改访问范围，不会新建另一个站点。</w:t>
       </w:r>
     </w:p>
     <w:p>
       <w:r>
-        <w:t>后续优先级：线上反馈与同步性能；专用房间调度和服务器 Python 隔离执行；持久回放；团队与八人；地图和迷雾。维护时同步更新 Markdown 原稿与 DOCX，不覆盖旧迁移，不改变 Sites 关联。</w:t>
+        <w:t>应用提交 b9125a7519a0eaf359422e92c4269ea6c266d6cf 的 GitHub CI 已通过：工作流 34741927055。它包含多轮逻辑与测试；之后的显示对比度修正需随最终应用构建一起发布。</w:t>
+      </w:r>
+    </w:p>
+    <w:p>
+      <w:r>
+        <w:t>数据库没有表结构变化，继续使用现有迁移。房间 JSON 格式升级为 2，旧房间返回“请创建新房间”，避免混用旧版协议。既有旧格式房间不会被静默重写。</w:t>
+      </w:r>
+    </w:p>
+    <w:p>
+      <w:r>
+        <w:t>后续维护仍需：修改对应文档原稿并生成 DOCX；规则修改补充必要测试；构建并双推送；只发布对应源码的构建；线上真实运行 Python 和房间操作。GitHub 推送本身不会自动发布网站。</w:t>
+      </w:r>
+    </w:p>
+    <w:p>
+      <w:r>
+        <w:br w:type="page"/>
+      </w:r>
+    </w:p>
+    <w:p>
+      <w:pPr>
+        <w:pStyle w:val="Heading1"/>
+      </w:pPr>
+      <w:r>
+        <w:t>已知限制与后续目标</w:t>
+      </w:r>
+    </w:p>
+    <w:p>
+      <w:r>
+        <w:t>这是客户端运行代码的休闲对战。没有服务端 Python 沙箱、严格反作弊、排位、账号、战争迷雾、队伍模式或完整持久回放；不声称实现这些能力。</w:t>
+      </w:r>
+    </w:p>
+    <w:p>
+      <w:r>
+        <w:t>离线时只保留最后动作，程序不会继续决策；刷新需重新运行。准备阶段离线超过 15 秒会取消准备；没有踢人/转移房主，永久离开的玩家需要大家新建房间。房间沿用创建一小时过期规则，准备不限时指没有强制开战倒计时。</w:t>
+      </w:r>
+    </w:p>
+    <w:p>
+      <w:r>
+        <w:t>三轮四人赛每人只访问四个位置中的三个，不能完全消除位置优势。三人可轮遍三处出生点。相同策略仍可能因到达资源时间和竞争产生不同结果。</w:t>
+      </w:r>
+    </w:p>
+    <w:p>
+      <w:r>
+        <w:t>约 400ms HTTP 同步、250ms 决策和 Canvas 插值，不等于 WebSocket 或生产延迟保证。尚未做公开并发压测，长时间所有客户端离线的模拟也不会逐步完整补算。</w:t>
+      </w:r>
+    </w:p>
+    <w:p>
+      <w:r>
+        <w:t>后续优先收集朋友试玩反馈：离线席位处理、地图镜像、完整回放及同步负载；可信服务端执行单独设计，不与本轮简单多人玩法混在一起。</w:t>
       </w:r>
     </w:p>
     <w:sectPr>

</xml_diff>

<commit_message>
Document public multi-round deployment and live verification
</commit_message>
<xml_diff>
--- a/docx/03-开发状态与验收记录.docx
+++ b/docx/03-开发状态与验收记录.docx
@@ -12,7 +12,7 @@
     </w:p>
     <w:p>
       <w:r>
-        <w:t>记录日期：2026-09-13 ｜ 阶段：v0.2 本地验收完成，待公开发布</w:t>
+        <w:t>记录日期：2026-09-13 ｜ 阶段：v0.2 已公开发布，线上验收通过</w:t>
       </w:r>
     </w:p>
     <w:p>
@@ -111,12 +111,17 @@
     </w:p>
     <w:p>
       <w:r>
-        <w:t>本轮应用尚未发布；完整赛程通过后发布并执行线上功能验收。此前线上版本为 Sites 版本 1；本轮不会改访问范围，不会新建另一个站点。</w:t>
+        <w:t>Sites 版本 2 已发布成功，应用提交为 5b616f7aaf1dfe823343809ee6dd1804f7883a9a。仍使用原公开网址和同一个站点。本文发布后的验收记录更新仅涉及文档，不改变线上应用。</w:t>
       </w:r>
     </w:p>
     <w:p>
       <w:r>
-        <w:t>应用提交 b9125a7519a0eaf359422e92c4269ea6c266d6cf 的 GitHub CI 已通过：工作流 34741927055。它包含多轮逻辑与测试；之后的显示对比度修正需随最终应用构建一起发布。</w:t>
+        <w:t>最终应用提交 5b616f7aaf1dfe823343809ee6dd1804f7883a9a 的 GitHub CI 已通过：工作流 34742228352（https://github.com/hjkc111/codinggame/actions/runs/34742228352）。规则测试和生产构建在 CI 独立验证。</w:t>
+      </w:r>
+    </w:p>
+    <w:p>
+      <w:r>
+        <w:t>线上验收通过：公开网站执行 browser-check，真实 Python、部署修改、暂停、超时隔离、手机布局、三客户端房间与权限检查均通过，无 pageerror。另从真实网页创建、加入、编辑取消准备、三人验证开战，Python / JavaScript / Python 都实际交付（检查时 18、13、13 EP）；轮次文字对比度已生效，无页面错误。完整九分钟三轮赛在本地验证，线上未重复完整赛程。</w:t>
       </w:r>
     </w:p>
     <w:p>

</xml_diff>